<commit_message>
Update card use reverse design document
</commit_message>
<xml_diff>
--- a/doc/GGeul_슬더스_카드사용_UI_역기획서.docx
+++ b/doc/GGeul_슬더스_카드사용_UI_역기획서.docx
@@ -10849,43 +10849,31 @@
             <w:vAlign w:val="center"/>
           </w:tcPr>
           <w:p>
-            <w:pPr>
-              <w:spacing w:after="20"/>
-            </w:pPr>
-            <w:r>
-              <w:rPr>
-                <w:sz w:val="16"/>
-              </w:rPr>
-              <w:t>하단 중앙 정렬.</w:t>
-            </w:r>
-          </w:p>
-        </w:tc>
-        <w:tc>
-          <w:tcPr>
-            <w:tcW w:w="3494" w:type="dxa"/>
-            <w:tcBorders>
-              <w:top w:val="single" w:sz="5" w:space="0" w:color="D8DEE8"/>
-              <w:left w:val="single" w:sz="5" w:space="0" w:color="D8DEE8"/>
-              <w:bottom w:val="single" w:sz="5" w:space="0" w:color="D8DEE8"/>
-              <w:right w:val="single" w:sz="5" w:space="0" w:color="D8DEE8"/>
-            </w:tcBorders>
-            <w:tcMar>
-              <w:top w:w="55" w:type="dxa"/>
-              <w:left w:w="65" w:type="dxa"/>
-              <w:bottom w:w="55" w:type="dxa"/>
-              <w:right w:w="65" w:type="dxa"/>
-            </w:tcMar>
-            <w:vAlign w:val="center"/>
-          </w:tcPr>
-          <w:p>
-            <w:pPr>
-              <w:spacing w:after="20"/>
-            </w:pPr>
-            <w:r>
-              <w:rPr>
-                <w:sz w:val="16"/>
-              </w:rPr>
-              <w:t>카드 5장은 완전 노출, 6장 이상은 겹치되 카드명/유형은 보여야 한다.</w:t>
+            <w:r>
+              <w:t>하단 중앙 정렬. 화면 비율에 따라 카드 표시 크기를 재계산한다.</w:t>
+            </w:r>
+          </w:p>
+        </w:tc>
+        <w:tc>
+          <w:tcPr>
+            <w:tcW w:w="3494" w:type="dxa"/>
+            <w:tcBorders>
+              <w:top w:val="single" w:sz="5" w:space="0" w:color="D8DEE8"/>
+              <w:left w:val="single" w:sz="5" w:space="0" w:color="D8DEE8"/>
+              <w:bottom w:val="single" w:sz="5" w:space="0" w:color="D8DEE8"/>
+              <w:right w:val="single" w:sz="5" w:space="0" w:color="D8DEE8"/>
+            </w:tcBorders>
+            <w:tcMar>
+              <w:top w:w="55" w:type="dxa"/>
+              <w:left w:w="65" w:type="dxa"/>
+              <w:bottom w:w="55" w:type="dxa"/>
+              <w:right w:w="65" w:type="dxa"/>
+            </w:tcMar>
+            <w:vAlign w:val="center"/>
+          </w:tcPr>
+          <w:p>
+            <w:r>
+              <w:t>인게임 손패 카드의 기본 폭은 현재 화면 가로의 약 1/4로 맞춘다. 카드 중심은 화면 하단에 두어 카드 아래 절반이 화면 밖으로 가려지게 배치한다. 카드 5장은 부채꼴 간격으로 겹치되 카드명/유형을 선택 가능하게 유지한다.</w:t>
             </w:r>
           </w:p>
         </w:tc>
@@ -10941,43 +10929,31 @@
             <w:vAlign w:val="center"/>
           </w:tcPr>
           <w:p>
-            <w:pPr>
-              <w:spacing w:after="20"/>
-            </w:pPr>
-            <w:r>
-              <w:rPr>
-                <w:sz w:val="16"/>
-              </w:rPr>
-              <w:t>선택 카드 확대.</w:t>
-            </w:r>
-          </w:p>
-        </w:tc>
-        <w:tc>
-          <w:tcPr>
-            <w:tcW w:w="3494" w:type="dxa"/>
-            <w:tcBorders>
-              <w:top w:val="single" w:sz="5" w:space="0" w:color="D8DEE8"/>
-              <w:left w:val="single" w:sz="5" w:space="0" w:color="D8DEE8"/>
-              <w:bottom w:val="single" w:sz="5" w:space="0" w:color="D8DEE8"/>
-              <w:right w:val="single" w:sz="5" w:space="0" w:color="D8DEE8"/>
-            </w:tcBorders>
-            <w:tcMar>
-              <w:top w:w="55" w:type="dxa"/>
-              <w:left w:w="65" w:type="dxa"/>
-              <w:bottom w:w="55" w:type="dxa"/>
-              <w:right w:w="65" w:type="dxa"/>
-            </w:tcMar>
-            <w:vAlign w:val="center"/>
-          </w:tcPr>
-          <w:p>
-            <w:pPr>
-              <w:spacing w:after="20"/>
-            </w:pPr>
-            <w:r>
-              <w:rPr>
-                <w:sz w:val="16"/>
-              </w:rPr>
-              <w:t>확대 배율은 텍스트가 읽히는 수준. 주변 카드와 충돌하지 않게 z-index 최상단.</w:t>
+            <w:r>
+              <w:t>선택 카드 확대 및 상승.</w:t>
+            </w:r>
+          </w:p>
+        </w:tc>
+        <w:tc>
+          <w:tcPr>
+            <w:tcW w:w="3494" w:type="dxa"/>
+            <w:tcBorders>
+              <w:top w:val="single" w:sz="5" w:space="0" w:color="D8DEE8"/>
+              <w:left w:val="single" w:sz="5" w:space="0" w:color="D8DEE8"/>
+              <w:bottom w:val="single" w:sz="5" w:space="0" w:color="D8DEE8"/>
+              <w:right w:val="single" w:sz="5" w:space="0" w:color="D8DEE8"/>
+            </w:tcBorders>
+            <w:tcMar>
+              <w:top w:w="55" w:type="dxa"/>
+              <w:left w:w="65" w:type="dxa"/>
+              <w:bottom w:w="55" w:type="dxa"/>
+              <w:right w:w="65" w:type="dxa"/>
+            </w:tcMar>
+            <w:vAlign w:val="center"/>
+          </w:tcPr>
+          <w:p>
+            <w:r>
+              <w:t>확대 배율은 텍스트가 읽히는 수준으로 유지하고, 기본 반응형 크기에서 위로 충분히 올라와 설명 영역을 읽을 수 있어야 한다. 주변 카드와 충돌하지 않게 z-index 최상단.</w:t>
             </w:r>
           </w:p>
         </w:tc>
@@ -12791,43 +12767,31 @@
             <w:vAlign w:val="center"/>
           </w:tcPr>
           <w:p>
-            <w:pPr>
-              <w:spacing w:after="20"/>
-            </w:pPr>
-            <w:r>
-              <w:rPr>
-                <w:sz w:val="16"/>
-              </w:rPr>
-              <w:t>손패 정렬, hover 확대, drag 시작/종료, z-index 관리</w:t>
-            </w:r>
-          </w:p>
-        </w:tc>
-        <w:tc>
-          <w:tcPr>
-            <w:tcW w:w="3494" w:type="dxa"/>
-            <w:tcBorders>
-              <w:top w:val="single" w:sz="5" w:space="0" w:color="D8DEE8"/>
-              <w:left w:val="single" w:sz="5" w:space="0" w:color="D8DEE8"/>
-              <w:bottom w:val="single" w:sz="5" w:space="0" w:color="D8DEE8"/>
-              <w:right w:val="single" w:sz="5" w:space="0" w:color="D8DEE8"/>
-            </w:tcBorders>
-            <w:tcMar>
-              <w:top w:w="55" w:type="dxa"/>
-              <w:left w:w="65" w:type="dxa"/>
-              <w:bottom w:w="55" w:type="dxa"/>
-              <w:right w:w="65" w:type="dxa"/>
-            </w:tcMar>
-            <w:vAlign w:val="center"/>
-          </w:tcPr>
-          <w:p>
-            <w:pPr>
-              <w:spacing w:after="20"/>
-            </w:pPr>
-            <w:r>
-              <w:rPr>
-                <w:sz w:val="16"/>
-              </w:rPr>
-              <w:t>카드 5~10장 상황에서 겹침 없이 조작 가능.</w:t>
+            <w:r>
+              <w:t>손패 정렬, 화면 폭 기반 카드 스케일링, 하단 반가림 배치, hover 확대, drag 시작/종료, z-index 관리</w:t>
+            </w:r>
+          </w:p>
+        </w:tc>
+        <w:tc>
+          <w:tcPr>
+            <w:tcW w:w="3494" w:type="dxa"/>
+            <w:tcBorders>
+              <w:top w:val="single" w:sz="5" w:space="0" w:color="D8DEE8"/>
+              <w:left w:val="single" w:sz="5" w:space="0" w:color="D8DEE8"/>
+              <w:bottom w:val="single" w:sz="5" w:space="0" w:color="D8DEE8"/>
+              <w:right w:val="single" w:sz="5" w:space="0" w:color="D8DEE8"/>
+            </w:tcBorders>
+            <w:tcMar>
+              <w:top w:w="55" w:type="dxa"/>
+              <w:left w:w="65" w:type="dxa"/>
+              <w:bottom w:w="55" w:type="dxa"/>
+              <w:right w:w="65" w:type="dxa"/>
+            </w:tcMar>
+            <w:vAlign w:val="center"/>
+          </w:tcPr>
+          <w:p>
+            <w:r>
+              <w:t>카드 기본 폭이 화면 가로의 약 25%로 반응하고, 기본 상태에서 카드 아래 절반이 화면 밖으로 숨겨진다. 카드 5~10장 상황에서 겹침 없이 조작 가능.</w:t>
             </w:r>
           </w:p>
         </w:tc>
@@ -13383,7 +13347,7 @@
         <w:ind w:left="312" w:hanging="130"/>
       </w:pPr>
       <w:r>
-        <w:t>[ ] 1366x768에서도 확대 카드가 중요한 UI를 가리지 않는다.</w:t>
+        <w:t>[ ] 1366x768과 1920x1080에서 손패 카드 기본 폭이 화면 가로의 약 1/4이고, 기본 위치에서 카드 아래 절반이 화면 밖으로 가려진다.</w:t>
       </w:r>
     </w:p>
     <w:p>

</xml_diff>